<commit_message>
Add application match score sync endpoint
</commit_message>
<xml_diff>
--- a/for review/Jobify_AI_Backend_Project_Documentation.docx
+++ b/for review/Jobify_AI_Backend_Project_Documentation.docx
@@ -14085,6 +14085,128 @@
     <w:p>
       <w:r>
         <w:t>The frontend chatbot should render bot text with lightweight Markdown formatting so bullets and bold labels appear cleanly, while recommended_jobs are displayed as clickable job cards. The Recommended for You page still calls POST /recommend-matches directly.</w:t>
+      </w:r>
+    </w:p>
+    <w:p>
+      <w:r>
+        <w:br w:type="page"/>
+      </w:r>
+    </w:p>
+    <w:p>
+      <w:pPr>
+        <w:pStyle w:val="Heading1"/>
+      </w:pPr>
+      <w:r>
+        <w:t>Featured Jobs Priority from Deployed Database</w:t>
+      </w:r>
+    </w:p>
+    <w:p>
+      <w:r>
+        <w:rPr>
+          <w:b/>
+        </w:rPr>
+        <w:t xml:space="preserve">Purpose: </w:t>
+      </w:r>
+      <w:r>
+        <w:t>make AI search and recommendations prefer jobs explicitly marked as featured in the deployed SQL Server database.</w:t>
+      </w:r>
+    </w:p>
+    <w:p>
+      <w:pPr>
+        <w:pStyle w:val="Heading2"/>
+      </w:pPr>
+      <w:r>
+        <w:t>How it works</w:t>
+      </w:r>
+    </w:p>
+    <w:p>
+      <w:pPr>
+        <w:pStyle w:val="ListBullet"/>
+      </w:pPr>
+      <w:r>
+        <w:t>The deployed backend stores the label in JobPostings.IsFeatured.</w:t>
+      </w:r>
+    </w:p>
+    <w:p>
+      <w:pPr>
+        <w:pStyle w:val="ListBullet"/>
+      </w:pPr>
+      <w:r>
+        <w:t>When POST /admin/sync-job-embedding runs, the AI backend reads IsFeatured if the column exists.</w:t>
+      </w:r>
+    </w:p>
+    <w:p>
+      <w:pPr>
+        <w:pStyle w:val="ListBullet"/>
+      </w:pPr>
+      <w:r>
+        <w:t>The value is saved in the local vector metadata database as jobs.is_featured.</w:t>
+      </w:r>
+    </w:p>
+    <w:p>
+      <w:pPr>
+        <w:pStyle w:val="ListBullet"/>
+      </w:pPr>
+      <w:r>
+        <w:t>Kaggle/imported jobs do not have this label, so they stay is_featured = 0 by default.</w:t>
+      </w:r>
+    </w:p>
+    <w:p>
+      <w:pPr>
+        <w:pStyle w:val="ListBullet"/>
+      </w:pPr>
+      <w:r>
+        <w:t>Search and recommendation results are sorted with featured jobs first, then semantic similarity order.</w:t>
+      </w:r>
+    </w:p>
+    <w:p>
+      <w:pPr>
+        <w:pStyle w:val="ListBullet"/>
+      </w:pPr>
+      <w:r>
+        <w:t>Frontend responses include isFeatured so the UI can show a Featured badge if desired.</w:t>
+      </w:r>
+    </w:p>
+    <w:p>
+      <w:pPr>
+        <w:pStyle w:val="Heading2"/>
+      </w:pPr>
+      <w:r>
+        <w:t>Main code change</w:t>
+      </w:r>
+    </w:p>
+    <w:p>
+      <w:r>
+        <w:rPr>
+          <w:rFonts w:ascii="Consolas" w:hAnsi="Consolas"/>
+          <w:sz w:val="18"/>
+        </w:rPr>
+        <w:t>sorted_rows = sorted(</w:t>
+        <w:br/>
+        <w:t xml:space="preserve">    rows,</w:t>
+        <w:br/>
+        <w:t xml:space="preserve">    key=lambda r: (</w:t>
+        <w:br/>
+        <w:t xml:space="preserve">        0 if as_bool(r['is_featured']) else 1,</w:t>
+        <w:br/>
+        <w:t xml:space="preserve">        id_to_rank.get(r['faiss_id'], 10**9),</w:t>
+        <w:br/>
+        <w:t xml:space="preserve">    ),</w:t>
+        <w:br/>
+        <w:t>)</w:t>
+      </w:r>
+    </w:p>
+    <w:p>
+      <w:pPr>
+        <w:pStyle w:val="Heading2"/>
+      </w:pPr>
+      <w:r>
+        <w:t>Frontend note</w:t>
+      </w:r>
+    </w:p>
+    <w:p>
+      <w:r>
+        <w:t>No separate frontend sorting is required. The backend already returns featured jobs first. The frontend can optionally display a Featured badge using the isFeatured field.</w:t>
       </w:r>
     </w:p>
     <w:sectPr>

</xml_diff>

<commit_message>
Update docs for connected frontend repo
</commit_message>
<xml_diff>
--- a/for review/Jobify_AI_Backend_Project_Documentation.docx
+++ b/for review/Jobify_AI_Backend_Project_Documentation.docx
@@ -14207,6 +14207,304 @@
     <w:p>
       <w:r>
         <w:t>No separate frontend sorting is required. The backend already returns featured jobs first. The frontend can optionally display a Featured badge using the isFeatured field.</w:t>
+      </w:r>
+    </w:p>
+    <w:p>
+      <w:r>
+        <w:br w:type="page"/>
+      </w:r>
+    </w:p>
+    <w:p>
+      <w:pPr>
+        <w:pStyle w:val="Heading1"/>
+      </w:pPr>
+      <w:r>
+        <w:t>Latest Frontend Integration Update</w:t>
+      </w:r>
+    </w:p>
+    <w:p>
+      <w:r>
+        <w:rPr>
+          <w:b/>
+        </w:rPr>
+        <w:t xml:space="preserve">A fresh frontend repository was cloned and connected to the Jobify AI backend through Next.js server-side proxy routes. </w:t>
+      </w:r>
+      <w:r>
+        <w:t>This keeps browser calls clean and avoids exposing the AI backend URL directly in client logic.</w:t>
+      </w:r>
+    </w:p>
+    <w:p>
+      <w:pPr>
+        <w:pStyle w:val="Heading2"/>
+      </w:pPr>
+      <w:r>
+        <w:t>Connected Frontend Location</w:t>
+      </w:r>
+    </w:p>
+    <w:p>
+      <w:r>
+        <w:t>Repository source: https://github.com/ibrahimsaleh8/Graduation_Project</w:t>
+      </w:r>
+    </w:p>
+    <w:p>
+      <w:r>
+        <w:t>Local connected copy: D:/Machine Learning Projects/ml/pro34/frontend/Graduation_Project</w:t>
+      </w:r>
+    </w:p>
+    <w:p>
+      <w:r>
+        <w:t>Previous frontend backup: frontend/Graduation_Project.backup_20260625_190042</w:t>
+      </w:r>
+    </w:p>
+    <w:p>
+      <w:pPr>
+        <w:pStyle w:val="Heading2"/>
+      </w:pPr>
+      <w:r>
+        <w:t>Frontend AI Proxy Routes</w:t>
+      </w:r>
+    </w:p>
+    <w:tbl>
+      <w:tblPr>
+        <w:tblStyle w:val="TableGrid"/>
+        <w:tblW w:type="auto" w:w="0"/>
+        <w:tblLook w:firstColumn="1" w:firstRow="1" w:lastColumn="0" w:lastRow="0" w:noHBand="0" w:noVBand="1" w:val="04A0"/>
+      </w:tblPr>
+      <w:tblGrid>
+        <w:gridCol w:w="3312"/>
+        <w:gridCol w:w="3312"/>
+        <w:gridCol w:w="3312"/>
+      </w:tblGrid>
+      <w:tr>
+        <w:tc>
+          <w:tcPr>
+            <w:tcW w:type="dxa" w:w="3312"/>
+          </w:tcPr>
+          <w:p>
+            <w:r>
+              <w:t>Frontend Route</w:t>
+            </w:r>
+          </w:p>
+        </w:tc>
+        <w:tc>
+          <w:tcPr>
+            <w:tcW w:type="dxa" w:w="3312"/>
+          </w:tcPr>
+          <w:p>
+            <w:r>
+              <w:t>AI Backend Route</w:t>
+            </w:r>
+          </w:p>
+        </w:tc>
+        <w:tc>
+          <w:tcPr>
+            <w:tcW w:type="dxa" w:w="3312"/>
+          </w:tcPr>
+          <w:p>
+            <w:r>
+              <w:t>Purpose</w:t>
+            </w:r>
+          </w:p>
+        </w:tc>
+      </w:tr>
+      <w:tr>
+        <w:tc>
+          <w:tcPr>
+            <w:tcW w:type="dxa" w:w="3312"/>
+          </w:tcPr>
+          <w:p>
+            <w:r>
+              <w:t>POST /api/ai/chat</w:t>
+            </w:r>
+          </w:p>
+        </w:tc>
+        <w:tc>
+          <w:tcPr>
+            <w:tcW w:type="dxa" w:w="3312"/>
+          </w:tcPr>
+          <w:p>
+            <w:r>
+              <w:t>/chat</w:t>
+            </w:r>
+          </w:p>
+        </w:tc>
+        <w:tc>
+          <w:tcPr>
+            <w:tcW w:type="dxa" w:w="3312"/>
+          </w:tcPr>
+          <w:p>
+            <w:r>
+              <w:t>Applicant AI chatbot and CV-aware recommendations</w:t>
+            </w:r>
+          </w:p>
+        </w:tc>
+      </w:tr>
+      <w:tr>
+        <w:tc>
+          <w:tcPr>
+            <w:tcW w:type="dxa" w:w="3312"/>
+          </w:tcPr>
+          <w:p>
+            <w:r>
+              <w:t>POST /api/ai/search</w:t>
+            </w:r>
+          </w:p>
+        </w:tc>
+        <w:tc>
+          <w:tcPr>
+            <w:tcW w:type="dxa" w:w="3312"/>
+          </w:tcPr>
+          <w:p>
+            <w:r>
+              <w:t>/search or /recommend-matches</w:t>
+            </w:r>
+          </w:p>
+        </w:tc>
+        <w:tc>
+          <w:tcPr>
+            <w:tcW w:type="dxa" w:w="3312"/>
+          </w:tcPr>
+          <w:p>
+            <w:r>
+              <w:t>Semantic job search and recommended jobs</w:t>
+            </w:r>
+          </w:p>
+        </w:tc>
+      </w:tr>
+      <w:tr>
+        <w:tc>
+          <w:tcPr>
+            <w:tcW w:type="dxa" w:w="3312"/>
+          </w:tcPr>
+          <w:p>
+            <w:r>
+              <w:t>POST /api/ai/company/chat</w:t>
+            </w:r>
+          </w:p>
+        </w:tc>
+        <w:tc>
+          <w:tcPr>
+            <w:tcW w:type="dxa" w:w="3312"/>
+          </w:tcPr>
+          <w:p>
+            <w:r>
+              <w:t>/chat/company/message</w:t>
+            </w:r>
+          </w:p>
+        </w:tc>
+        <w:tc>
+          <w:tcPr>
+            <w:tcW w:type="dxa" w:w="3312"/>
+          </w:tcPr>
+          <w:p>
+            <w:r>
+              <w:t>Company recruiter chatbot</w:t>
+            </w:r>
+          </w:p>
+        </w:tc>
+      </w:tr>
+      <w:tr>
+        <w:tc>
+          <w:tcPr>
+            <w:tcW w:type="dxa" w:w="3312"/>
+          </w:tcPr>
+          <w:p>
+            <w:r>
+              <w:t>POST /api/ai/company/find-candidates</w:t>
+            </w:r>
+          </w:p>
+        </w:tc>
+        <w:tc>
+          <w:tcPr>
+            <w:tcW w:type="dxa" w:w="3312"/>
+          </w:tcPr>
+          <w:p>
+            <w:r>
+              <w:t>/chat/company/find-candidates</w:t>
+            </w:r>
+          </w:p>
+        </w:tc>
+        <w:tc>
+          <w:tcPr>
+            <w:tcW w:type="dxa" w:w="3312"/>
+          </w:tcPr>
+          <w:p>
+            <w:r>
+              <w:t>Company candidate ranking for a job</w:t>
+            </w:r>
+          </w:p>
+        </w:tc>
+      </w:tr>
+    </w:tbl>
+    <w:p>
+      <w:pPr>
+        <w:pStyle w:val="Heading2"/>
+      </w:pPr>
+      <w:r>
+        <w:t>Frontend Environment</w:t>
+      </w:r>
+    </w:p>
+    <w:p>
+      <w:pPr>
+        <w:pStyle w:val="ListBullet"/>
+      </w:pPr>
+      <w:r>
+        <w:t>AI_BACKEND_URL=http://127.0.0.1:8000</w:t>
+      </w:r>
+    </w:p>
+    <w:p>
+      <w:pPr>
+        <w:pStyle w:val="ListBullet"/>
+      </w:pPr>
+      <w:r>
+        <w:t>NEXT_PUBLIC_BACKEND_URL=&lt;main-dotnet-backend-url&gt;</w:t>
+      </w:r>
+    </w:p>
+    <w:p>
+      <w:pPr>
+        <w:pStyle w:val="ListBullet"/>
+      </w:pPr>
+      <w:r>
+        <w:t>NEXT_PUBLIC_MOCK_APPLICANT_ID=d5ce65a3-599f-457a-8aef-cb2621f4146e</w:t>
+      </w:r>
+    </w:p>
+    <w:p>
+      <w:pPr>
+        <w:pStyle w:val="ListBullet"/>
+      </w:pPr>
+      <w:r>
+        <w:t>NEXT_PUBLIC_MOCK_COMPANY_ID=AB16E3E4-B398-454E-B62B-0F2D6BAD9411</w:t>
+      </w:r>
+    </w:p>
+    <w:p>
+      <w:pPr>
+        <w:pStyle w:val="ListBullet"/>
+      </w:pPr>
+      <w:r>
+        <w:t>NEXT_PUBLIC_MOCK_COMPANY_USER_ID=abc88b66-93a8-47c2-9242-5c3f76fa038c</w:t>
+      </w:r>
+    </w:p>
+    <w:p>
+      <w:pPr>
+        <w:pStyle w:val="Heading2"/>
+      </w:pPr>
+      <w:r>
+        <w:t>Tested Result</w:t>
+      </w:r>
+    </w:p>
+    <w:p>
+      <w:r>
+        <w:t>Applicant chat and company chat were tested through the fresh frontend on http://127.0.0.1:3000 while the AI backend was running on http://127.0.0.1:8000. Both proxy routes successfully reached the AI backend.</w:t>
+      </w:r>
+    </w:p>
+    <w:p>
+      <w:r>
+        <w:t>A deployed database company record was selected for company-side testing: Lockman and Sons, CompanyID AB16E3E4-B398-454E-B62B-0F2D6BAD9411, UserID abc88b66-93a8-47c2-9242-5c3f76fa038c, Email Liza30@hotmail.com.</w:t>
+      </w:r>
+    </w:p>
+    <w:p>
+      <w:r>
+        <w:t>Real login still requires the actual password or a reset test account from the .NET backend because the deployed database stores only PasswordHash.</w:t>
       </w:r>
     </w:p>
     <w:sectPr>

</xml_diff>